<commit_message>
Recognize direct axiom schema instances and explain substitutions
</commit_message>
<xml_diff>
--- a/lab22/output/LR1_variant3.docx
+++ b/lab22/output/LR1_variant3.docx
@@ -78,7 +78,7 @@
     </w:p>
     <w:p>
       <w:r>
-        <w:t>Проверка на Python 3.12.14 и 3.14.3 завершилась успешно: 52 автоматических теста на каждой версии. Демонстрационное доказательство содержит семь принятых строк. Отрицательный набор содержит восемь отклоненных формул.</w:t>
+        <w:t>Проверка на Python 3.12.14 и 3.14.3 завершилась успешно: 60 автоматических тестов на каждой версии. Демонстрационное доказательство содержит семь принятых строк. Отрицательный набор содержит восемь отклоненных формул.</w:t>
       </w:r>
     </w:p>
     <w:p>
@@ -119,7 +119,7 @@
     </w:p>
     <w:p>
       <w:r>
-        <w:t>Импликация используется только как сокращение. Ее раскрытие выполняется при разборе; семантические преобразования дерева не выполняются. Исходные аксиомы заданы конкретными формулами:</w:t>
+        <w:t>Импликация используется только как сокращение. Ее раскрытие выполняется при разборе; семантические преобразования дерева не выполняются. Аксиомы трактуются как схемы с согласованными подстановками параметров:</w:t>
       </w:r>
     </w:p>
     <w:p>
@@ -254,7 +254,7 @@
     </w:p>
     <w:p>
       <w:r>
-        <w:t>В β заменяются все вхождения ровно одной переменной x на одно дерево X. Вставляемая формула может быть составной. Одновременная замена разных переменных требует нескольких строк доказательства.</w:t>
+        <w:t>В β заменяются все вхождения ровно одной переменной x на одно дерево X. Вставляемая формула может быть составной. Для β замена разных переменных требует нескольких строк. Прямой экземпляр схемы аксиомы принимается сразу, в том числе с несколькими подстановками.</w:t>
       </w:r>
     </w:p>
     <w:p>
@@ -759,7 +759,7 @@
     </w:p>
     <w:p>
       <w:r>
-        <w:t>Сеанс хранит семь аксиом, принятые строки Step и их основания Reason. Источник Reference указывает номер аксиомы или более ранней строки. Доступные деревья индексируются словарем; для MP дополнительно строится индекс по консеквенту. Ошибочная строка не изменяет ни доказательство, ни индексы.</w:t>
+        <w:t>Сеанс хранит семь схем аксиом, принятые строки Step и их основания Reason. Источник Reference указывает номер аксиомы или более ранней строки. Доступные деревья индексируются словарем; для MP дополнительно строится индекс по консеквенту. Ошибочная строка не изменяет ни доказательство, ни индексы.</w:t>
       </w:r>
     </w:p>
     <w:p>
@@ -777,7 +777,7 @@
     </w:p>
     <w:p>
       <w:r>
-        <w:t>2. Проверить точное совпадение с аксиомой или ранее доказанной формулой. Для повтора сохранить ссылку на первое основание.</w:t>
+        <w:t>2. Проверить прямое совпадение со схемой аксиомы и вывести ее номер и подстановки. Затем проверить повтор ранее доказанной строки.</w:t>
       </w:r>
     </w:p>
     <w:p>
@@ -836,7 +836,7 @@
     </w:p>
     <w:p>
       <w:r>
-        <w:t>Индукция по принятым строкам: исходные аксиомы разрешены по определению; повтор ссылается на уже установленный факт; MP проверяет обе посылки; сопоставление β строит свидетельство одной равномерной подстановки. Поэтому каждая новая строка имеет разрешенное основание. Будущие и отклоненные строки недоступны.</w:t>
+        <w:t>Индукция по принятым строкам: прямые экземпляры схем разрешены по определению; повтор ссылается на уже установленный факт; MP проверяет обе посылки; сопоставление β строит свидетельство одной равномерной подстановки. Поэтому каждая новая строка имеет разрешенное основание. Будущие и отклоненные строки недоступны.</w:t>
       </w:r>
     </w:p>
     <w:p>
@@ -859,7 +859,7 @@
     </w:p>
     <w:p>
       <w:r>
-        <w:t>Файл examples/demo.txt содержит последовательность из семи формул. В ней отдельно показаны β из аксиомы, β из предыдущей строки, составная вставка и два применения MP. Аксиомы доступны без предварительного ручного ввода.</w:t>
+        <w:t>Файл examples/demo.txt содержит последовательность из семи формул. Первые пять строк — экземпляры схем. Шестая строка получается по MP, седьмая — одной β из предыдущей строки. Аксиомы доступны без предварительного ручного ввода.</w:t>
       </w:r>
     </w:p>
     <w:p>
@@ -880,7 +880,7 @@
         <w:spacing w:after="220"/>
       </w:pPr>
       <w:r>
-        <w:t>β из A7: p заменяется на ¬q.</w:t>
+        <w:t>Экземпляр A7: p := ¬q.</w:t>
       </w:r>
     </w:p>
     <w:p>
@@ -901,7 +901,7 @@
         <w:spacing w:after="220"/>
       </w:pPr>
       <w:r>
-        <w:t>β из A6: p заменяется на q.</w:t>
+        <w:t>Экземпляр A6: p := q; q := q.</w:t>
       </w:r>
     </w:p>
     <w:p>
@@ -922,7 +922,7 @@
         <w:spacing w:after="220"/>
       </w:pPr>
       <w:r>
-        <w:t>MP из строк 2 и 1.</w:t>
+        <w:t>Экземпляр A7: p := q.</w:t>
       </w:r>
     </w:p>
     <w:p>
@@ -943,7 +943,7 @@
         <w:spacing w:after="220"/>
       </w:pPr>
       <w:r>
-        <w:t>β из A1: q заменяется на r.</w:t>
+        <w:t>Экземпляр A1: p := p; q := r.</w:t>
       </w:r>
     </w:p>
     <w:p>
@@ -964,7 +964,7 @@
         <w:spacing w:after="220"/>
       </w:pPr>
       <w:r>
-        <w:t>β из строки 4: p заменяется на (q ⊃ q).</w:t>
+        <w:t>Экземпляр A1: p := (q ⊃ q); q := r.</w:t>
       </w:r>
     </w:p>
     <w:p>
@@ -1011,7 +1011,7 @@
     </w:p>
     <w:p>
       <w:r>
-        <w:t>В строке 3 существует и другое основание — β из A7. В текущем сеансе программа сначала обнаруживает MP. Наличие нескольких корректных оснований не влияет на результат проверки.</w:t>
+        <w:t>Для строки 3 возможен и MP из 2 и 1, но программа приоритетно распознает прямой экземпляр A7. Метка аксиомы не ставится на основании цепочки преобразований: шестая и седьмая строки имеют основания MP и β.</w:t>
       </w:r>
     </w:p>
     <w:p>
@@ -1034,7 +1034,7 @@
     </w:p>
     <w:p>
       <w:r>
-        <w:t>Выполнены 52 теста стандартного unittest на Windows 11 с Python 3.12.14 и Python 3.14.3. Дополнительно проверены компиляция исходников, встроенная демонстрация, ее запуск из файла и отрицательный файл. Команда tools/verify.py сохраняет результаты и коды выхода.</w:t>
+        <w:t>Выполнены 60 тестов стандартного unittest на Windows 11 с Python 3.12.14 и Python 3.14.3. Дополнительно проверены компиляция исходников, встроенная демонстрация, ее запуск из файла и отрицательный файл. Команда tools/verify.py сохраняет результаты и коды выхода.</w:t>
       </w:r>
     </w:p>
     <w:tbl>
@@ -1177,7 +1177,7 @@
                 <w:b w:val="0"/>
                 <w:sz w:val="21"/>
               </w:rPr>
-              <w:t>52/52 на каждой из двух версий Python</w:t>
+              <w:t>60/60 на каждой из двух версий Python</w:t>
             </w:r>
           </w:p>
         </w:tc>
@@ -1672,7 +1672,7 @@
     </w:p>
     <w:p>
       <w:r>
-        <w:t>Логические отрицательные случаи: две замены вместо одной, замена только части вхождений, отсутствие антецедента MP, попытка получить посылку из заключения, автоматическая перестановка дизъюнктов и добавление неверной строки в доступную базу. В примере a⊃(a∨b) первый шаг отвергается, но после a⊃(a∨q) результат принимается отдельной заменой q на b.</w:t>
+        <w:t>Логические отрицательные случаи: две замены вместо одной в β производной формулы, замена только части вхождений, отсутствие антецедента MP, попытка получить посылку из заключения, автоматическая перестановка дизъюнктов и добавление неверной строки в доступную базу. Формула a⊃(a∨b) принимается сразу как экземпляр A1. Случай (¬¬¬q⊃¬q)⊃(q⊃¬¬q) распознается как A6, а разные выражения на местах одного параметра отвергаются.</w:t>
       </w:r>
     </w:p>
     <w:p>

</xml_diff>